<commit_message>
Clarify custom FIO installation paths
</commit_message>
<xml_diff>
--- a/docs/FreqInOut 2.0.2 Installation and Upgrade Guide.docx
+++ b/docs/FreqInOut 2.0.2 Installation and Upgrade Guide.docx
@@ -553,7 +553,7 @@
                 <w:b w:val="0"/>
                 <w:i w:val="0"/>
               </w:rPr>
-              <w:t>The base application folder is FreqInOut under your home folder. Do not create a side-by-side test installation for this procedure.</w:t>
+              <w:t>Use the same FreqInOut application folder used by the existing installation. The platform examples default to FreqInOut under your home folder; change the path variable when your installation is elsewhere.</w:t>
             </w:r>
           </w:p>
         </w:tc>
@@ -789,7 +789,7 @@
           <w:i w:val="0"/>
           <w:color w:val="1F2937"/>
         </w:rPr>
-        <w:t xml:space="preserve">The normal application folder is </w:t>
+        <w:t>The commands use $HOME\FreqInOut on Windows and $HOME/FreqInOut on Linux/macOS as default examples. $HOME means your operating system home folder. If you originally installed FIO somewhere else, replace the complete example path with the path to that existing FIO application folder. Use the same application folder for every status, update, installer, and launcher command. This is the application-code location, not the station profile or database folder.</w:t>
       </w:r>
       <w:r>
         <w:rPr>
@@ -798,7 +798,6 @@
           <w:i w:val="0"/>
           <w:sz w:val="17"/>
         </w:rPr>
-        <w:t>$HOME\FreqInOut</w:t>
       </w:r>
       <w:r>
         <w:rPr>
@@ -806,7 +805,6 @@
           <w:b w:val="0"/>
           <w:i w:val="0"/>
         </w:rPr>
-        <w:t xml:space="preserve"> on Windows and </w:t>
       </w:r>
       <w:r>
         <w:rPr>
@@ -815,7 +813,6 @@
           <w:i w:val="0"/>
           <w:sz w:val="17"/>
         </w:rPr>
-        <w:t>$HOME/FreqInOut</w:t>
       </w:r>
       <w:r>
         <w:rPr>
@@ -823,7 +820,6 @@
           <w:b w:val="0"/>
           <w:i w:val="0"/>
         </w:rPr>
-        <w:t xml:space="preserve"> on Linux/macOS. Each platform section first checks whether that folder is a Git checkout.</w:t>
       </w:r>
     </w:p>
     <w:tbl>
@@ -932,7 +928,7 @@
                 <w:b w:val="0"/>
                 <w:i w:val="0"/>
               </w:rPr>
-              <w:t>Update the checkout in the normal FreqInOut folder, then run the installer.</w:t>
+              <w:t>Update the checkout in its existing FreqInOut application folder, wherever it was installed, then run the installer.</w:t>
             </w:r>
           </w:p>
         </w:tc>
@@ -1078,7 +1074,7 @@
           <w:i w:val="0"/>
           <w:color w:val="17365D"/>
         </w:rPr>
-        <w:t xml:space="preserve">2.  Clear any temporary test profile and check the base folder.  </w:t>
+        <w:t>2.  Set the FIO application folder, clear any temporary test profile, and check the folder.</w:t>
       </w:r>
       <w:r>
         <w:rPr>
@@ -1086,7 +1082,7 @@
           <w:b w:val="0"/>
           <w:i w:val="0"/>
         </w:rPr>
-        <w:t>Copy and run this block. The last command prints True for a Git checkout and False for a ZIP/non-Git or missing folder.</w:t>
+        <w:t xml:space="preserve">  The first line uses the default location. Change that one quoted path if FIO was originally installed somewhere else, then keep this PowerShell window open so the remaining commands can reuse $FioInstall. The last command prints True for a Git checkout and False for a ZIP/non-Git or missing folder.</w:t>
       </w:r>
     </w:p>
     <w:tbl>
@@ -1125,7 +1121,13 @@
                 <w:i w:val="0"/>
                 <w:sz w:val="17"/>
               </w:rPr>
+              <w:t>$FioInstall = "$HOME\FreqInOut"  # Change this complete path if FIO was installed elsewhere.</w:t>
+              <w:br/>
               <w:t>Remove-Item Env:FREQINOUT_CONFIG_DIR -ErrorAction SilentlyContinue</w:t>
+              <w:br/>
+              <w:t>Remove-Item Env:FREQINOUT_RUNTIME_ROOT -ErrorAction SilentlyContinue</w:t>
+              <w:br/>
+              <w:t>Test-Path "$FioInstall\.git"</w:t>
             </w:r>
             <w:r>
               <w:rPr>
@@ -1134,7 +1136,6 @@
                 <w:i w:val="0"/>
                 <w:sz w:val="17"/>
               </w:rPr>
-              <w:br/>
             </w:r>
             <w:r>
               <w:rPr>
@@ -1143,7 +1144,6 @@
                 <w:i w:val="0"/>
                 <w:sz w:val="17"/>
               </w:rPr>
-              <w:t>Remove-Item Env:FREQINOUT_RUNTIME_ROOT -ErrorAction SilentlyContinue</w:t>
             </w:r>
             <w:r>
               <w:rPr>
@@ -1152,7 +1152,6 @@
                 <w:i w:val="0"/>
                 <w:sz w:val="17"/>
               </w:rPr>
-              <w:br/>
             </w:r>
             <w:r>
               <w:rPr>
@@ -1161,7 +1160,6 @@
                 <w:i w:val="0"/>
                 <w:sz w:val="17"/>
               </w:rPr>
-              <w:t>Test-Path "$HOME\FreqInOut\.git"</w:t>
             </w:r>
           </w:p>
         </w:tc>
@@ -1240,7 +1238,9 @@
                 <w:i w:val="0"/>
                 <w:sz w:val="17"/>
               </w:rPr>
-              <w:t>Set-Location "$HOME\FreqInOut"</w:t>
+              <w:t>Set-Location "$FioInstall"</w:t>
+              <w:br/>
+              <w:t>git status --short</w:t>
             </w:r>
             <w:r>
               <w:rPr>
@@ -1249,7 +1249,6 @@
                 <w:i w:val="0"/>
                 <w:sz w:val="17"/>
               </w:rPr>
-              <w:br/>
             </w:r>
             <w:r>
               <w:rPr>
@@ -1258,7 +1257,6 @@
                 <w:i w:val="0"/>
                 <w:sz w:val="17"/>
               </w:rPr>
-              <w:t>git status --short</w:t>
             </w:r>
           </w:p>
         </w:tc>
@@ -1562,7 +1560,13 @@
                 <w:i w:val="0"/>
                 <w:sz w:val="17"/>
               </w:rPr>
-              <w:t>if (Test-Path "$HOME\FreqInOut") {</w:t>
+              <w:t>if (Test-Path "$FioInstall") {</w:t>
+              <w:br/>
+              <w:t xml:space="preserve">  $stamp = Get-Date -Format "yyyyMMdd-HHmmss"</w:t>
+              <w:br/>
+              <w:t xml:space="preserve">  Move-Item "$FioInstall" "${FioInstall}-before-2.0.2-$stamp"</w:t>
+              <w:br/>
+              <w:t>}</w:t>
             </w:r>
             <w:r>
               <w:rPr>
@@ -1571,7 +1575,6 @@
                 <w:i w:val="0"/>
                 <w:sz w:val="17"/>
               </w:rPr>
-              <w:br/>
             </w:r>
             <w:r>
               <w:rPr>
@@ -1580,7 +1583,6 @@
                 <w:i w:val="0"/>
                 <w:sz w:val="17"/>
               </w:rPr>
-              <w:t xml:space="preserve">  $stamp = Get-Date -Format "yyyyMMdd-HHmmss"</w:t>
             </w:r>
             <w:r>
               <w:rPr>
@@ -1589,7 +1591,6 @@
                 <w:i w:val="0"/>
                 <w:sz w:val="17"/>
               </w:rPr>
-              <w:br/>
             </w:r>
             <w:r>
               <w:rPr>
@@ -1598,7 +1599,6 @@
                 <w:i w:val="0"/>
                 <w:sz w:val="17"/>
               </w:rPr>
-              <w:t xml:space="preserve">  Move-Item "$HOME\FreqInOut" "$HOME\FreqInOut-before-2.0.2-$stamp"</w:t>
             </w:r>
             <w:r>
               <w:rPr>
@@ -1607,7 +1607,6 @@
                 <w:i w:val="0"/>
                 <w:sz w:val="17"/>
               </w:rPr>
-              <w:br/>
             </w:r>
             <w:r>
               <w:rPr>
@@ -1616,7 +1615,6 @@
                 <w:i w:val="0"/>
                 <w:sz w:val="17"/>
               </w:rPr>
-              <w:t>}</w:t>
             </w:r>
           </w:p>
         </w:tc>
@@ -1689,9 +1687,9 @@
               </w:rPr>
               <w:t>git clone "https://github.com/N1MAG/FreqInOut.git" `</w:t>
               <w:br/>
-              <w:t xml:space="preserve">  "$HOME\FreqInOut"</w:t>
+              <w:t xml:space="preserve">  "$FioInstall"</w:t>
               <w:br/>
-              <w:t>Set-Location "$HOME\FreqInOut"</w:t>
+              <w:t>Set-Location "$FioInstall"</w:t>
               <w:br/>
               <w:t>git describe --tags --always --dirty</w:t>
             </w:r>
@@ -2053,7 +2051,7 @@
           <w:i w:val="0"/>
           <w:color w:val="17365D"/>
         </w:rPr>
-        <w:t xml:space="preserve">2.  Clear any temporary test profile and check the base folder.  </w:t>
+        <w:t>2.  Set the FIO application folder, clear any temporary test profile, and check the folder.</w:t>
       </w:r>
       <w:r>
         <w:rPr>
@@ -2061,7 +2059,7 @@
           <w:b w:val="0"/>
           <w:i w:val="0"/>
         </w:rPr>
-        <w:t>The final line says GIT when the base folder is a Git checkout and NOT-GIT when it is a ZIP/non-Git or missing folder.</w:t>
+        <w:t xml:space="preserve">  The first line uses the default location. Change that one quoted path if FIO was originally installed somewhere else, then keep this terminal open so the remaining commands can reuse FIO_INSTALL. The final line says GIT for a Git checkout and NOT-GIT for a ZIP/non-Git or missing folder.</w:t>
       </w:r>
     </w:p>
     <w:tbl>
@@ -2100,7 +2098,11 @@
                 <w:i w:val="0"/>
                 <w:sz w:val="17"/>
               </w:rPr>
+              <w:t>FIO_INSTALL="$HOME/FreqInOut"  # Change this complete path if FIO was installed elsewhere.</w:t>
+              <w:br/>
               <w:t>unset FREQINOUT_CONFIG_DIR FREQINOUT_RUNTIME_ROOT</w:t>
+              <w:br/>
+              <w:t>if [ -d "$FIO_INSTALL/.git" ]; then echo GIT; else echo NOT-GIT; fi</w:t>
             </w:r>
             <w:r>
               <w:rPr>
@@ -2109,7 +2111,6 @@
                 <w:i w:val="0"/>
                 <w:sz w:val="17"/>
               </w:rPr>
-              <w:br/>
             </w:r>
             <w:r>
               <w:rPr>
@@ -2118,7 +2119,6 @@
                 <w:i w:val="0"/>
                 <w:sz w:val="17"/>
               </w:rPr>
-              <w:t>if [ -d "$HOME/FreqInOut/.git" ]; then echo GIT; else echo NOT-GIT; fi</w:t>
             </w:r>
           </w:p>
         </w:tc>
@@ -2197,7 +2197,9 @@
                 <w:i w:val="0"/>
                 <w:sz w:val="17"/>
               </w:rPr>
-              <w:t>cd "$HOME/FreqInOut"</w:t>
+              <w:t>cd "$FIO_INSTALL"</w:t>
+              <w:br/>
+              <w:t>git status --short</w:t>
             </w:r>
             <w:r>
               <w:rPr>
@@ -2206,7 +2208,6 @@
                 <w:i w:val="0"/>
                 <w:sz w:val="17"/>
               </w:rPr>
-              <w:br/>
             </w:r>
             <w:r>
               <w:rPr>
@@ -2215,7 +2216,6 @@
                 <w:i w:val="0"/>
                 <w:sz w:val="17"/>
               </w:rPr>
-              <w:t>git status --short</w:t>
             </w:r>
           </w:p>
         </w:tc>
@@ -2519,7 +2519,11 @@
                 <w:i w:val="0"/>
                 <w:sz w:val="17"/>
               </w:rPr>
-              <w:t>if [ -e "$HOME/FreqInOut" ]; then</w:t>
+              <w:t>if [ -e "$FIO_INSTALL" ]; then</w:t>
+              <w:br/>
+              <w:t xml:space="preserve">  mv "$FIO_INSTALL" "${FIO_INSTALL}-before-2.0.2-$(date +%Y%m%d-%H%M%S)"</w:t>
+              <w:br/>
+              <w:t>fi</w:t>
             </w:r>
             <w:r>
               <w:rPr>
@@ -2528,7 +2532,6 @@
                 <w:i w:val="0"/>
                 <w:sz w:val="17"/>
               </w:rPr>
-              <w:br/>
             </w:r>
             <w:r>
               <w:rPr>
@@ -2537,7 +2540,6 @@
                 <w:i w:val="0"/>
                 <w:sz w:val="17"/>
               </w:rPr>
-              <w:t xml:space="preserve">  mv "$HOME/FreqInOut" "$HOME/FreqInOut-before-2.0.2-$(date +%Y%m%d-%H%M%S)"</w:t>
             </w:r>
             <w:r>
               <w:rPr>
@@ -2546,7 +2548,6 @@
                 <w:i w:val="0"/>
                 <w:sz w:val="17"/>
               </w:rPr>
-              <w:br/>
             </w:r>
             <w:r>
               <w:rPr>
@@ -2555,7 +2556,6 @@
                 <w:i w:val="0"/>
                 <w:sz w:val="17"/>
               </w:rPr>
-              <w:t>fi</w:t>
             </w:r>
           </w:p>
         </w:tc>
@@ -2628,9 +2628,9 @@
               </w:rPr>
               <w:t>git clone "https://github.com/N1MAG/FreqInOut.git" \</w:t>
               <w:br/>
-              <w:t xml:space="preserve">  "$HOME/FreqInOut"</w:t>
+              <w:t xml:space="preserve">  "$FIO_INSTALL"</w:t>
               <w:br/>
-              <w:t>cd "$HOME/FreqInOut"</w:t>
+              <w:t>cd "$FIO_INSTALL"</w:t>
               <w:br/>
               <w:t>git describe --tags --always --dirty</w:t>
             </w:r>
@@ -3111,7 +3111,7 @@
           <w:i w:val="0"/>
           <w:color w:val="17365D"/>
         </w:rPr>
-        <w:t xml:space="preserve">2.  Clear any temporary test profile and check the base folder.  </w:t>
+        <w:t>2.  Set the FIO application folder, clear any temporary test profile, and check the folder.</w:t>
       </w:r>
       <w:r>
         <w:rPr>
@@ -3119,7 +3119,7 @@
           <w:b w:val="0"/>
           <w:i w:val="0"/>
         </w:rPr>
-        <w:t>The final line says GIT when the base folder is a Git checkout and NOT-GIT when it is a ZIP/non-Git or missing folder.</w:t>
+        <w:t xml:space="preserve">  The first line uses the default location. Change that one quoted path if FIO was originally installed somewhere else, then keep this terminal open so the remaining commands can reuse FIO_INSTALL. The final line says GIT for a Git checkout and NOT-GIT for a ZIP/non-Git or missing folder.</w:t>
       </w:r>
     </w:p>
     <w:tbl>
@@ -3158,7 +3158,11 @@
                 <w:i w:val="0"/>
                 <w:sz w:val="17"/>
               </w:rPr>
+              <w:t>FIO_INSTALL="$HOME/FreqInOut"  # Change this complete path if FIO was installed elsewhere.</w:t>
+              <w:br/>
               <w:t>unset FREQINOUT_CONFIG_DIR FREQINOUT_RUNTIME_ROOT</w:t>
+              <w:br/>
+              <w:t>if [ -d "$FIO_INSTALL/.git" ]; then echo GIT; else echo NOT-GIT; fi</w:t>
             </w:r>
             <w:r>
               <w:rPr>
@@ -3167,7 +3171,6 @@
                 <w:i w:val="0"/>
                 <w:sz w:val="17"/>
               </w:rPr>
-              <w:br/>
             </w:r>
             <w:r>
               <w:rPr>
@@ -3176,7 +3179,6 @@
                 <w:i w:val="0"/>
                 <w:sz w:val="17"/>
               </w:rPr>
-              <w:t>if [ -d "$HOME/FreqInOut/.git" ]; then echo GIT; else echo NOT-GIT; fi</w:t>
             </w:r>
           </w:p>
         </w:tc>
@@ -3255,7 +3257,9 @@
                 <w:i w:val="0"/>
                 <w:sz w:val="17"/>
               </w:rPr>
-              <w:t>cd "$HOME/FreqInOut"</w:t>
+              <w:t>cd "$FIO_INSTALL"</w:t>
+              <w:br/>
+              <w:t>git status --short</w:t>
             </w:r>
             <w:r>
               <w:rPr>
@@ -3264,7 +3268,6 @@
                 <w:i w:val="0"/>
                 <w:sz w:val="17"/>
               </w:rPr>
-              <w:br/>
             </w:r>
             <w:r>
               <w:rPr>
@@ -3273,7 +3276,6 @@
                 <w:i w:val="0"/>
                 <w:sz w:val="17"/>
               </w:rPr>
-              <w:t>git status --short</w:t>
             </w:r>
           </w:p>
         </w:tc>
@@ -3577,7 +3579,11 @@
                 <w:i w:val="0"/>
                 <w:sz w:val="17"/>
               </w:rPr>
-              <w:t>if [ -e "$HOME/FreqInOut" ]; then</w:t>
+              <w:t>if [ -e "$FIO_INSTALL" ]; then</w:t>
+              <w:br/>
+              <w:t xml:space="preserve">  mv "$FIO_INSTALL" "${FIO_INSTALL}-before-2.0.2-$(date +%Y%m%d-%H%M%S)"</w:t>
+              <w:br/>
+              <w:t>fi</w:t>
             </w:r>
             <w:r>
               <w:rPr>
@@ -3586,7 +3592,6 @@
                 <w:i w:val="0"/>
                 <w:sz w:val="17"/>
               </w:rPr>
-              <w:br/>
             </w:r>
             <w:r>
               <w:rPr>
@@ -3595,7 +3600,6 @@
                 <w:i w:val="0"/>
                 <w:sz w:val="17"/>
               </w:rPr>
-              <w:t xml:space="preserve">  mv "$HOME/FreqInOut" "$HOME/FreqInOut-before-2.0.2-$(date +%Y%m%d-%H%M%S)"</w:t>
             </w:r>
             <w:r>
               <w:rPr>
@@ -3604,7 +3608,6 @@
                 <w:i w:val="0"/>
                 <w:sz w:val="17"/>
               </w:rPr>
-              <w:br/>
             </w:r>
             <w:r>
               <w:rPr>
@@ -3613,7 +3616,6 @@
                 <w:i w:val="0"/>
                 <w:sz w:val="17"/>
               </w:rPr>
-              <w:t>fi</w:t>
             </w:r>
           </w:p>
         </w:tc>
@@ -3686,9 +3688,9 @@
               </w:rPr>
               <w:t>git clone "https://github.com/N1MAG/FreqInOut.git" \</w:t>
               <w:br/>
-              <w:t xml:space="preserve">  "$HOME/FreqInOut"</w:t>
+              <w:t xml:space="preserve">  "$FIO_INSTALL"</w:t>
               <w:br/>
-              <w:t>cd "$HOME/FreqInOut"</w:t>
+              <w:t>cd "$FIO_INSTALL"</w:t>
               <w:br/>
               <w:t>git describe --tags --always --dirty</w:t>
             </w:r>

</xml_diff>